<commit_message>
chore: release portfolio 1.2.1
</commit_message>
<xml_diff>
--- a/public/files/Aniket_Kumar_DevOps_Resume_ATS_Final_v2.docx
+++ b/public/files/Aniket_Kumar_DevOps_Resume_ATS_Final_v2.docx
@@ -69,9 +69,9 @@
         <w:rPr>
           <w:rFonts w:ascii="Calibri" w:hAnsi="Calibri"/>
           <w:b w:val="0"/>
-          <w:sz w:val="20"/>
+          <w:sz w:val="18"/>
         </w:rPr>
-        <w:t>DevOps Engineer with 3+ years of experience building high-availability infrastructure, CI/CD automation, Kubernetes workloads, observability platforms, and database HA/DR systems across cloud and on-prem environments. Strong background in production operations, team leadership, cloud cost optimization, and DevSecOps practices including container vulnerability scanning.</w:t>
+        <w:t>DevOps Engineer with 3+ years of professional experience in production infrastructure, cloud migrations, Kubernetes, CI/CD automation, observability, and cloud cost optimization. Experienced in cross-cloud migration, cloud-to-on-premise transition, Linux systems, containerized workloads, monitoring stacks, and infrastructure automation using Terraform and Ansible.</w:t>
       </w:r>
     </w:p>
     <w:p>
@@ -93,7 +93,7 @@
     </w:p>
     <w:p>
       <w:pPr>
-        <w:spacing w:after="20" w:line="250" w:lineRule="exact"/>
+        <w:spacing w:after="20" w:line="236" w:lineRule="exact"/>
       </w:pPr>
       <w:r>
         <w:rPr>
@@ -101,19 +101,19 @@
           <w:b/>
           <w:sz w:val="20"/>
         </w:rPr>
-        <w:t>Cloud &amp; Infrastructure:</w:t>
+        <w:t>Cloud:</w:t>
       </w:r>
       <w:r>
         <w:rPr>
           <w:rFonts w:ascii="Calibri" w:hAnsi="Calibri"/>
           <w:sz w:val="20"/>
         </w:rPr>
-        <w:t xml:space="preserve"> OCI, AWS, GCP, Linux, Nginx, Load Balancing, DNS, HA Architecture, Disaster Recovery, FinOps</w:t>
+        <w:t xml:space="preserve"> AWS, OCI, Azure, GCP, Cloud Migration, Cloud Cost Optimization, Disaster Recovery</w:t>
       </w:r>
     </w:p>
     <w:p>
       <w:pPr>
-        <w:spacing w:after="20" w:line="250" w:lineRule="exact"/>
+        <w:spacing w:after="20" w:line="236" w:lineRule="exact"/>
       </w:pPr>
       <w:r>
         <w:rPr>
@@ -121,19 +121,19 @@
           <w:b/>
           <w:sz w:val="20"/>
         </w:rPr>
-        <w:t>Containers &amp; CI/CD:</w:t>
+        <w:t>Infrastructure:</w:t>
       </w:r>
       <w:r>
         <w:rPr>
           <w:rFonts w:ascii="Calibri" w:hAnsi="Calibri"/>
           <w:sz w:val="20"/>
         </w:rPr>
-        <w:t xml:space="preserve"> Docker, Kubernetes, Docker Compose, Jenkins, GitLab CI, GitHub Actions, Grype</w:t>
+        <w:t xml:space="preserve"> Linux, Docker, Kubernetes, Terraform, Ansible, Nginx, HAProxy, Load Balancing, DNS, HA Architecture</w:t>
       </w:r>
     </w:p>
     <w:p>
       <w:pPr>
-        <w:spacing w:after="20" w:line="250" w:lineRule="exact"/>
+        <w:spacing w:after="20" w:line="236" w:lineRule="exact"/>
       </w:pPr>
       <w:r>
         <w:rPr>
@@ -141,19 +141,19 @@
           <w:b/>
           <w:sz w:val="20"/>
         </w:rPr>
-        <w:t>Observability &amp; Databases:</w:t>
+        <w:t>CI/CD &amp; Observability:</w:t>
       </w:r>
       <w:r>
         <w:rPr>
           <w:rFonts w:ascii="Calibri" w:hAnsi="Calibri"/>
           <w:sz w:val="20"/>
         </w:rPr>
-        <w:t xml:space="preserve"> Prometheus, Grafana, Loki, Alertmanager, PromQL, PostgreSQL, MySQL, MongoDB, Redis, KeyDB, ClickHouse</w:t>
+        <w:t xml:space="preserve"> Jenkins, GitHub Actions, GitLab CI/CD, Prometheus, Grafana, Alertmanager, Loki, Custom Exporters</w:t>
       </w:r>
     </w:p>
     <w:p>
       <w:pPr>
-        <w:spacing w:after="20" w:line="250" w:lineRule="exact"/>
+        <w:spacing w:after="20" w:line="236" w:lineRule="exact"/>
       </w:pPr>
       <w:r>
         <w:rPr>
@@ -161,14 +161,14 @@
           <w:b/>
           <w:sz w:val="20"/>
         </w:rPr>
-        <w:t>Security, IAM &amp; Programming:</w:t>
+        <w:t>Databases, Security &amp; Scripting:</w:t>
       </w:r>
       <w:r>
         <w:rPr>
           <w:rFonts w:ascii="Calibri" w:hAnsi="Calibri"/>
           <w:sz w:val="20"/>
         </w:rPr>
-        <w:t xml:space="preserve"> Keycloak, LDAP, SAML/OIDC, DevSecOps, Burp Suite, VAPT Fundamentals, Python, Bash, Go, Django/DRF, Ansible, Git</w:t>
+        <w:t xml:space="preserve"> PostgreSQL, MySQL, MongoDB, Redis, Keycloak, SAML/OIDC, SSL/TLS, RBAC, Secrets Management, Bash, Python, Git</w:t>
       </w:r>
     </w:p>
     <w:p>
@@ -231,7 +231,7 @@
     <w:p>
       <w:pPr>
         <w:pStyle w:val="ListBullet"/>
-        <w:spacing w:before="0" w:after="20" w:line="250" w:lineRule="exact"/>
+        <w:spacing w:before="0" w:after="20" w:line="236" w:lineRule="exact"/>
         <w:ind w:left="360"/>
       </w:pPr>
       <w:r>
@@ -239,13 +239,13 @@
           <w:rFonts w:ascii="Calibri" w:hAnsi="Calibri"/>
           <w:sz w:val="20"/>
         </w:rPr>
-        <w:t>Owned HA infrastructure, CI/CD, observability, and cloud operations for 15+ production apps, sustaining 99.9% uptime SLA across all client deployments.</w:t>
+        <w:t>Own production infrastructure, CI/CD, observability, and cloud operations for 15+ applications, sustaining 99.9% uptime SLA across client deployments.</w:t>
       </w:r>
     </w:p>
     <w:p>
       <w:pPr>
         <w:pStyle w:val="ListBullet"/>
-        <w:spacing w:before="0" w:after="20" w:line="250" w:lineRule="exact"/>
+        <w:spacing w:before="0" w:after="20" w:line="236" w:lineRule="exact"/>
         <w:ind w:left="360"/>
       </w:pPr>
       <w:r>
@@ -253,13 +253,13 @@
           <w:rFonts w:ascii="Calibri" w:hAnsi="Calibri"/>
           <w:sz w:val="20"/>
         </w:rPr>
-        <w:t>Led a team of 8 engineers/interns; introduced code reviews, runbooks, incident practices, and on-call rotation, reducing MTTR by 40%.</w:t>
+        <w:t>Planned and executed cross-cloud migration work, including scheduled downtime windows, near real-time cutover approaches, validation, and post-migration stabilization.</w:t>
       </w:r>
     </w:p>
     <w:p>
       <w:pPr>
         <w:pStyle w:val="ListBullet"/>
-        <w:spacing w:before="0" w:after="20" w:line="250" w:lineRule="exact"/>
+        <w:spacing w:before="0" w:after="20" w:line="236" w:lineRule="exact"/>
         <w:ind w:left="360"/>
       </w:pPr>
       <w:r>
@@ -267,13 +267,13 @@
           <w:rFonts w:ascii="Calibri" w:hAnsi="Calibri"/>
           <w:sz w:val="20"/>
         </w:rPr>
-        <w:t>Built Jenkins, GitLab CI, and GitHub Actions pipelines for automated build-test-deploy workflows, increasing release cadence from bi-weekly to multiple daily deployments.</w:t>
+        <w:t>Supported cloud-to-on-premise migration initiatives involving infrastructure planning, service cutover, data movement, reverse proxy updates, and production readiness checks.</w:t>
       </w:r>
     </w:p>
     <w:p>
       <w:pPr>
         <w:pStyle w:val="ListBullet"/>
-        <w:spacing w:before="0" w:after="20" w:line="250" w:lineRule="exact"/>
+        <w:spacing w:before="0" w:after="20" w:line="236" w:lineRule="exact"/>
         <w:ind w:left="360"/>
       </w:pPr>
       <w:r>
@@ -281,13 +281,13 @@
           <w:rFonts w:ascii="Calibri" w:hAnsi="Calibri"/>
           <w:sz w:val="20"/>
         </w:rPr>
-        <w:t>Containerized 20+ services with multi-stage Dockerfiles; managed Kubernetes workloads with rolling updates and zero-downtime releases, reducing image size by 60%.</w:t>
+        <w:t>Built repeatable infrastructure and delivery workflows using Terraform, Ansible, Docker, Jenkins, GitLab CI, and GitHub Actions.</w:t>
       </w:r>
     </w:p>
     <w:p>
       <w:pPr>
         <w:pStyle w:val="ListBullet"/>
-        <w:spacing w:before="0" w:after="20" w:line="250" w:lineRule="exact"/>
+        <w:spacing w:before="0" w:after="20" w:line="236" w:lineRule="exact"/>
         <w:ind w:left="360"/>
       </w:pPr>
       <w:r>
@@ -295,13 +295,13 @@
           <w:rFonts w:ascii="Calibri" w:hAnsi="Calibri"/>
           <w:sz w:val="20"/>
         </w:rPr>
-        <w:t>Integrated Grype-based container vulnerability scanning into CI/CD gates, enforcing security policies and reducing production vulnerability exposure by 90%.</w:t>
+        <w:t>Containerized 20+ services; managed Kubernetes workloads with rolling updates, zero-downtime release practices, and Grype-based CI/CD security gates.</w:t>
       </w:r>
     </w:p>
     <w:p>
       <w:pPr>
         <w:pStyle w:val="ListBullet"/>
-        <w:spacing w:before="0" w:after="20" w:line="250" w:lineRule="exact"/>
+        <w:spacing w:before="0" w:after="20" w:line="236" w:lineRule="exact"/>
         <w:ind w:left="360"/>
       </w:pPr>
       <w:r>
@@ -309,13 +309,13 @@
           <w:rFonts w:ascii="Calibri" w:hAnsi="Calibri"/>
           <w:sz w:val="20"/>
         </w:rPr>
-        <w:t>Designed HA data platforms: PostgreSQL + Patroni, MySQL Group Replication, MongoDB Replica Sets, ClickHouse, Redis Sentinel, and KeyDB with backup, PITR, and failover runbooks.</w:t>
+        <w:t>Operated monitoring and troubleshooting workflows using Prometheus, Grafana, Loki, Alertmanager, PromQL dashboards, and custom exporters.</w:t>
       </w:r>
     </w:p>
     <w:p>
       <w:pPr>
         <w:pStyle w:val="ListBullet"/>
-        <w:spacing w:before="0" w:after="20" w:line="250" w:lineRule="exact"/>
+        <w:spacing w:before="0" w:after="20" w:line="236" w:lineRule="exact"/>
         <w:ind w:left="360"/>
       </w:pPr>
       <w:r>
@@ -323,7 +323,21 @@
           <w:rFonts w:ascii="Calibri" w:hAnsi="Calibri"/>
           <w:sz w:val="20"/>
         </w:rPr>
-        <w:t>Implemented DR automation with snapshots, cross-region backup replication, and recovery runbooks, achieving sub-30-minute RTO; optimized cloud spend by 25% via rightsizing and reserved capacity.</w:t>
+        <w:t>Managed HA data platforms including PostgreSQL + Patroni, MySQL Group Replication, MongoDB Replica Sets, ClickHouse, Redis Sentinel, and KeyDB.</w:t>
+      </w:r>
+    </w:p>
+    <w:p>
+      <w:pPr>
+        <w:pStyle w:val="ListBullet"/>
+        <w:spacing w:before="0" w:after="20" w:line="236" w:lineRule="exact"/>
+        <w:ind w:left="360"/>
+      </w:pPr>
+      <w:r>
+        <w:rPr>
+          <w:rFonts w:ascii="Calibri" w:hAnsi="Calibri"/>
+          <w:sz w:val="20"/>
+        </w:rPr>
+        <w:t>Optimized cloud spend by 25% through usage review, rightsizing, cleanup of underutilized resources, and cost visibility improvements.</w:t>
       </w:r>
     </w:p>
     <w:p>
@@ -369,7 +383,7 @@
     <w:p>
       <w:pPr>
         <w:pStyle w:val="ListBullet"/>
-        <w:spacing w:before="0" w:after="20" w:line="250" w:lineRule="exact"/>
+        <w:spacing w:before="0" w:after="20" w:line="236" w:lineRule="exact"/>
         <w:ind w:left="360"/>
       </w:pPr>
       <w:r>
@@ -377,13 +391,13 @@
           <w:rFonts w:ascii="Calibri" w:hAnsi="Calibri"/>
           <w:sz w:val="20"/>
         </w:rPr>
-        <w:t>Built the organization's observability stack from scratch using Prometheus, Alertmanager, Grafana, Loki, and Fluent Bit across 100+ hosts and 200+ containers.</w:t>
+        <w:t>Built observability coverage using Prometheus, Alertmanager, Grafana, Loki, and Fluent Bit across 100+ hosts and 200+ containers.</w:t>
       </w:r>
     </w:p>
     <w:p>
       <w:pPr>
         <w:pStyle w:val="ListBullet"/>
-        <w:spacing w:before="0" w:after="20" w:line="250" w:lineRule="exact"/>
+        <w:spacing w:before="0" w:after="20" w:line="236" w:lineRule="exact"/>
         <w:ind w:left="360"/>
       </w:pPr>
       <w:r>
@@ -397,7 +411,7 @@
     <w:p>
       <w:pPr>
         <w:pStyle w:val="ListBullet"/>
-        <w:spacing w:before="0" w:after="20" w:line="250" w:lineRule="exact"/>
+        <w:spacing w:before="0" w:after="20" w:line="236" w:lineRule="exact"/>
         <w:ind w:left="360"/>
       </w:pPr>
       <w:r>
@@ -438,7 +452,7 @@
     <w:p>
       <w:pPr>
         <w:pStyle w:val="ListBullet"/>
-        <w:spacing w:before="0" w:after="20" w:line="250" w:lineRule="exact"/>
+        <w:spacing w:before="0" w:after="20" w:line="236" w:lineRule="exact"/>
         <w:ind w:left="360"/>
       </w:pPr>
       <w:r>
@@ -447,6 +461,47 @@
           <w:sz w:val="20"/>
         </w:rPr>
         <w:t>Developed Django/DRF backend APIs and VueJS/TailwindCSS interfaces for a no-code application platform.</w:t>
+      </w:r>
+    </w:p>
+    <w:p>
+      <w:pPr>
+        <w:tabs>
+          <w:tab w:pos="10656" w:val="right"/>
+        </w:tabs>
+        <w:spacing w:before="60" w:after="0"/>
+      </w:pPr>
+      <w:r>
+        <w:rPr>
+          <w:rFonts w:ascii="Calibri" w:hAnsi="Calibri"/>
+          <w:b/>
+          <w:sz w:val="21"/>
+        </w:rPr>
+        <w:t>Software Development Intern — All World Gayatri Pariwar</w:t>
+      </w:r>
+      <w:r>
+        <w:tab/>
+      </w:r>
+      <w:r>
+        <w:rPr>
+          <w:rFonts w:ascii="Calibri" w:hAnsi="Calibri"/>
+          <w:color w:val="444444"/>
+          <w:sz w:val="19"/>
+        </w:rPr>
+        <w:t>Feb 2021 – May 2021</w:t>
+      </w:r>
+    </w:p>
+    <w:p>
+      <w:pPr>
+        <w:pStyle w:val="ListBullet"/>
+        <w:spacing w:before="0" w:after="20" w:line="236" w:lineRule="exact"/>
+        <w:ind w:left="360"/>
+      </w:pPr>
+      <w:r>
+        <w:rPr>
+          <w:rFonts w:ascii="Calibri" w:hAnsi="Calibri"/>
+          <w:sz w:val="20"/>
+        </w:rPr>
+        <w:t>Supported bug fixes, feature updates, ERP development, and project documentation for internal software systems.</w:t>
       </w:r>
     </w:p>
     <w:p>
@@ -508,7 +563,7 @@
     </w:p>
     <w:sectPr>
       <w:pgSz w:w="12240" w:h="15840"/>
-      <w:pgMar w:top="720" w:right="792" w:bottom="720" w:left="792" w:header="720" w:footer="720" w:gutter="0"/>
+      <w:pgMar w:top="605" w:right="720" w:bottom="605" w:left="720" w:header="720" w:footer="720" w:gutter="0"/>
       <w:cols w:space="720"/>
       <w:docGrid w:linePitch="360"/>
     </w:sectPr>
@@ -880,12 +935,12 @@
     <w:qFormat/>
     <w:rsid w:val="00FC693F"/>
     <w:pPr>
-      <w:spacing w:before="0" w:after="0" w:line="260" w:lineRule="exact"/>
+      <w:spacing w:before="0" w:after="0" w:line="240" w:lineRule="exact"/>
     </w:pPr>
     <w:rPr>
       <w:rFonts w:ascii="Calibri" w:hAnsi="Calibri"/>
       <w:color w:val="1A1A1A"/>
-      <w:sz w:val="21"/>
+      <w:sz w:val="19"/>
     </w:rPr>
   </w:style>
   <w:style w:type="paragraph" w:styleId="Header">

</xml_diff>